<commit_message>
Web SPA: sessione completa, nutrizione, calendario, sidebar, checklist
- web: pagine template, workout-session, exercises, settings, chatbot (nuovi file)
- web: sessione con tutti i campi (effort, RIR, note, timer recupero, last session ref)
- web: calendario con eliminazione sessioni
- web: nutrizione con macro completi per ogni alimento loggato
- web: sidebar allargata (w-72), font nav text-lg, badge V rimosso
- web: fix insert nutrition_logs (rimosso food_item_id non presente nello schema)
- CLAUDE.md: aggiornato con documentazione completa della web SPA
- Vyro_Guida_Utente.docx: aggiornato a v1.1
- CHECKLIST.xlsx: checklist funzionalità con dropdown interattivi
- .gitignore: escluso .claude/settings.local.json

Co-Authored-By: Claude Sonnet 4.6 <noreply@anthropic.com>
</commit_message>
<xml_diff>
--- a/Vyro_Guida_Utente.docx
+++ b/Vyro_Guida_Utente.docx
@@ -1,5 +1,49 @@
 
-<file path=word/document.xml><?xml version="1.0" encoding="utf-8"?>
+<file path=customXml\item1.xml><?xml version="1.0" encoding="utf-8"?>
+<b:Sources xmlns:b="http://schemas.openxmlformats.org/officeDocument/2006/bibliography" xmlns="http://schemas.openxmlformats.org/officeDocument/2006/bibliography" SelectedStyle="\APASixthEditionOfficeOnline.xsl" StyleName="APA" Version="6"/>
+</file>
+
+<file path=customXml\itemProps1.xml><?xml version="1.0" encoding="utf-8"?>
+<ds:datastoreItem xmlns:ds="http://schemas.openxmlformats.org/officeDocument/2006/customXml" ds:itemID="{4AB94AA9-5461-4C3E-AD30-AEF177091988}">
+  <ds:schemaRefs>
+    <ds:schemaRef ds:uri="http://schemas.openxmlformats.org/officeDocument/2006/bibliography"/>
+  </ds:schemaRefs>
+</ds:datastoreItem>
+</file>
+
+<file path=docProps\app.xml><?xml version="1.0" encoding="utf-8"?>
+<Properties xmlns="http://schemas.openxmlformats.org/officeDocument/2006/extended-properties" xmlns:vt="http://schemas.openxmlformats.org/officeDocument/2006/docPropsVTypes">
+  <Template>Normal.dotm</Template>
+  <TotalTime>189</TotalTime>
+  <Pages>22</Pages>
+  <Words>2972</Words>
+  <Characters>16947</Characters>
+  <Application>Microsoft Office Word</Application>
+  <DocSecurity>0</DocSecurity>
+  <Lines>141</Lines>
+  <Paragraphs>39</Paragraphs>
+  <ScaleCrop>false</ScaleCrop>
+  <Company/>
+  <LinksUpToDate>false</LinksUpToDate>
+  <CharactersWithSpaces>19880</CharactersWithSpaces>
+  <SharedDoc>false</SharedDoc>
+  <HyperlinksChanged>false</HyperlinksChanged>
+  <AppVersion>16.0000</AppVersion>
+</Properties>
+</file>
+
+<file path=docProps\core.xml><?xml version="1.0" encoding="utf-8"?>
+<cp:coreProperties xmlns:cp="http://schemas.openxmlformats.org/package/2006/metadata/core-properties" xmlns:dc="http://purl.org/dc/elements/1.1/" xmlns:dcterms="http://purl.org/dc/terms/" xmlns:dcmitype="http://purl.org/dc/dcmitype/" xmlns:xsi="http://www.w3.org/2001/XMLSchema-instance">
+  <dc:title/>
+  <dc:creator>Un-named</dc:creator>
+  <cp:lastModifiedBy>Alessandro Polizzi</cp:lastModifiedBy>
+  <cp:revision>6</cp:revision>
+  <dcterms:created xsi:type="dcterms:W3CDTF">2026-04-08T08:53:00Z</dcterms:created>
+  <dcterms:modified xsi:type="dcterms:W3CDTF">2026-04-08T13:11:00Z</dcterms:modified>
+</cp:coreProperties>
+</file>
+
+<file path=word\document.xml><?xml version="1.0" encoding="utf-8"?>
 <w:document xmlns:wpc="http://schemas.microsoft.com/office/word/2010/wordprocessingCanvas" xmlns:cx="http://schemas.microsoft.com/office/drawing/2014/chartex" xmlns:cx1="http://schemas.microsoft.com/office/drawing/2015/9/8/chartex" xmlns:cx2="http://schemas.microsoft.com/office/drawing/2015/10/21/chartex" xmlns:cx3="http://schemas.microsoft.com/office/drawing/2016/5/9/chartex" xmlns:cx4="http://schemas.microsoft.com/office/drawing/2016/5/10/chartex" xmlns:cx5="http://schemas.microsoft.com/office/drawing/2016/5/11/chartex" xmlns:cx6="http://schemas.microsoft.com/office/drawing/2016/5/12/chartex" xmlns:cx7="http://schemas.microsoft.com/office/drawing/2016/5/13/chartex" xmlns:cx8="http://schemas.microsoft.com/office/drawing/2016/5/14/chartex" xmlns:mc="http://schemas.openxmlformats.org/markup-compatibility/2006" xmlns:aink="http://schemas.microsoft.com/office/drawing/2016/ink" xmlns:am3d="http://schemas.microsoft.com/office/drawing/2017/model3d" xmlns:o="urn:schemas-microsoft-com:office:office" xmlns:oel="http://schemas.microsoft.com/office/2019/extlst" xmlns:r="http://schemas.openxmlformats.org/officeDocument/2006/relationships" xmlns:m="http://schemas.openxmlformats.org/officeDocument/2006/math" xmlns:v="urn:schemas-microsoft-com:vml" xmlns:wp14="http://schemas.microsoft.com/office/word/2010/wordprocessingDrawing" xmlns:wp="http://schemas.openxmlformats.org/drawingml/2006/wordprocessingDrawing" xmlns:w10="urn:schemas-microsoft-com:office:word" xmlns:w="http://schemas.openxmlformats.org/wordprocessingml/2006/main" xmlns:w14="http://schemas.microsoft.com/office/word/2010/wordml" xmlns:w15="http://schemas.microsoft.com/office/word/2012/wordml" xmlns:w16cex="http://schemas.microsoft.com/office/word/2018/wordml/cex" xmlns:w16cid="http://schemas.microsoft.com/office/word/2016/wordml/cid" xmlns:w16="http://schemas.microsoft.com/office/word/2018/wordml" xmlns:w16du="http://schemas.microsoft.com/office/word/2023/wordml/word16du" xmlns:w16sdtdh="http://schemas.microsoft.com/office/word/2020/wordml/sdtdatahash" xmlns:w16sdtfl="http://schemas.microsoft.com/office/word/2024/wordml/sdtformatlock" xmlns:w16se="http://schemas.microsoft.com/office/word/2015/wordml/symex" xmlns:wpg="http://schemas.microsoft.com/office/word/2010/wordprocessingGroup" xmlns:wpi="http://schemas.microsoft.com/office/word/2010/wordprocessingInk" xmlns:wne="http://schemas.microsoft.com/office/word/2006/wordml" xmlns:wps="http://schemas.microsoft.com/office/word/2010/wordprocessingShape" mc:Ignorable="w14 w15 w16se w16cid w16 w16cex w16sdtdh w16sdtfl w16du wp14">
   <w:body>
     <w:p>
@@ -144,7 +188,7 @@
         <w:rPr>
           <w:color w:val="555555"/>
         </w:rPr>
-        <w:t xml:space="preserve">1.0 · </w:t>
+        <w:t xml:space="preserve">1.1 · </w:t>
       </w:r>
       <w:proofErr w:type="gramStart"/>
       <w:r>
@@ -4733,7 +4777,7 @@
         <w:spacing w:before="60" w:after="100"/>
       </w:pPr>
       <w:r>
-        <w:t>Nella schermata di modifica del template, tieni premuto un esercizio e trascinalo nella posizione desiderata. L'interfaccia supporta il drag-and-drop.</w:t>
+        <w:t>Nella schermata del template, usa le frecce ▲ e ▼ accanto a ciascun esercizio per spostarlo su o giù nella lista.</w:t>
       </w:r>
     </w:p>
     <w:p>
@@ -5356,7 +5400,7 @@
                 <w:sz w:val="20"/>
                 <w:szCs w:val="20"/>
               </w:rPr>
-              <w:t>Per ogni serie vedi: peso target, reps target, recupero e tipo sforzo</w:t>
+              <w:t>Per ogni serie vedi: peso e reps target, recupero, tipo sforzo, riferimento all'ultima sessione e note aggiuntive</w:t>
             </w:r>
           </w:p>
         </w:tc>
@@ -5699,7 +5743,7 @@
                 <w:b/>
                 <w:bCs/>
               </w:rPr>
-              <w:t>Tocca "Avvia timer"</w:t>
+              <w:t>Tocca "Segna come completata"</w:t>
             </w:r>
           </w:p>
           <w:p>
@@ -5711,7 +5755,7 @@
                 <w:sz w:val="20"/>
                 <w:szCs w:val="20"/>
               </w:rPr>
-              <w:t>Parte il countdown del recupero</w:t>
+              <w:t>La serie viene salvata; se la serie ha un tempo di recupero impostato, il timer parte automaticamente</w:t>
             </w:r>
           </w:p>
         </w:tc>
@@ -5733,7 +5777,7 @@
                 <w:b/>
                 <w:bCs/>
               </w:rPr>
-              <w:t>Tocca "Completa serie"</w:t>
+              <w:t>Conferma il completamento</w:t>
             </w:r>
           </w:p>
           <w:p>
@@ -5745,7 +5789,7 @@
                 <w:sz w:val="20"/>
                 <w:szCs w:val="20"/>
               </w:rPr>
-              <w:t>La serie viene salvata e marcata come completata</w:t>
+              <w:t>La serie appare evidenziata come completata nella lista</w:t>
             </w:r>
           </w:p>
         </w:tc>
@@ -6447,7 +6491,7 @@
                 <w:sz w:val="20"/>
                 <w:szCs w:val="20"/>
               </w:rPr>
-              <w:t>Inserisci peso, reps e tocca "Avvia timer"</w:t>
+              <w:t>Inserisci peso, reps e Tocca "Segna come completata"</w:t>
             </w:r>
           </w:p>
         </w:tc>
@@ -7542,7 +7586,7 @@
         <w:spacing w:before="60" w:after="100"/>
       </w:pPr>
       <w:r>
-        <w:t>Dal dettaglio sessione, tocca il bottone "Elimina" per rimuovere definitivamente quella sessione dal tuo storico.</w:t>
+        <w:t>Tocca il pulsante ✕ accanto alla sessione desiderata per rimuoverla definitivamente dal tuo storico.</w:t>
       </w:r>
     </w:p>
     <w:p>
@@ -8888,7 +8932,7 @@
                 <w:sz w:val="20"/>
                 <w:szCs w:val="20"/>
               </w:rPr>
-              <w:t>Il sistema calcola automaticamente macro e calorie</w:t>
+              <w:t>Il sistema calcola automaticamente macro e calorie; ogni alimento nel diario mostra peso, kcal, proteine, carboidrati e grassi</w:t>
             </w:r>
           </w:p>
         </w:tc>
@@ -10297,23 +10341,7 @@
                 <w:sz w:val="20"/>
                 <w:szCs w:val="20"/>
               </w:rPr>
-              <w:t xml:space="preserve">Mostra nome utente e indirizzo </w:t>
-            </w:r>
-            <w:proofErr w:type="gramStart"/>
-            <w:r>
-              <w:rPr>
-                <w:sz w:val="20"/>
-                <w:szCs w:val="20"/>
-              </w:rPr>
-              <w:t>email</w:t>
-            </w:r>
-            <w:proofErr w:type="gramEnd"/>
-            <w:r>
-              <w:rPr>
-                <w:sz w:val="20"/>
-                <w:szCs w:val="20"/>
-              </w:rPr>
-              <w:t xml:space="preserve"> associato all'account</w:t>
+              <w:t xml:space="preserve">Mostra il nickname e l'email dell'account. Il nickname è modificabile in qualsiasi momento dalle Impostazioni.</w:t>
             </w:r>
           </w:p>
         </w:tc>
@@ -12203,7 +12231,7 @@
 </w:document>
 </file>
 
-<file path=word/endnotes.xml><?xml version="1.0" encoding="utf-8"?>
+<file path=word\endnotes.xml><?xml version="1.0" encoding="utf-8"?>
 <w:endnotes xmlns:wpc="http://schemas.microsoft.com/office/word/2010/wordprocessingCanvas" xmlns:cx="http://schemas.microsoft.com/office/drawing/2014/chartex" xmlns:cx1="http://schemas.microsoft.com/office/drawing/2015/9/8/chartex" xmlns:cx2="http://schemas.microsoft.com/office/drawing/2015/10/21/chartex" xmlns:cx3="http://schemas.microsoft.com/office/drawing/2016/5/9/chartex" xmlns:cx4="http://schemas.microsoft.com/office/drawing/2016/5/10/chartex" xmlns:cx5="http://schemas.microsoft.com/office/drawing/2016/5/11/chartex" xmlns:cx6="http://schemas.microsoft.com/office/drawing/2016/5/12/chartex" xmlns:cx7="http://schemas.microsoft.com/office/drawing/2016/5/13/chartex" xmlns:cx8="http://schemas.microsoft.com/office/drawing/2016/5/14/chartex" xmlns:mc="http://schemas.openxmlformats.org/markup-compatibility/2006" xmlns:aink="http://schemas.microsoft.com/office/drawing/2016/ink" xmlns:am3d="http://schemas.microsoft.com/office/drawing/2017/model3d" xmlns:o="urn:schemas-microsoft-com:office:office" xmlns:oel="http://schemas.microsoft.com/office/2019/extlst" xmlns:r="http://schemas.openxmlformats.org/officeDocument/2006/relationships" xmlns:m="http://schemas.openxmlformats.org/officeDocument/2006/math" xmlns:v="urn:schemas-microsoft-com:vml" xmlns:wp14="http://schemas.microsoft.com/office/word/2010/wordprocessingDrawing" xmlns:wp="http://schemas.openxmlformats.org/drawingml/2006/wordprocessingDrawing" xmlns:w10="urn:schemas-microsoft-com:office:word" xmlns:w="http://schemas.openxmlformats.org/wordprocessingml/2006/main" xmlns:w14="http://schemas.microsoft.com/office/word/2010/wordml" xmlns:w15="http://schemas.microsoft.com/office/word/2012/wordml" xmlns:w16cex="http://schemas.microsoft.com/office/word/2018/wordml/cex" xmlns:w16cid="http://schemas.microsoft.com/office/word/2016/wordml/cid" xmlns:w16="http://schemas.microsoft.com/office/word/2018/wordml" xmlns:w16du="http://schemas.microsoft.com/office/word/2023/wordml/word16du" xmlns:w16sdtdh="http://schemas.microsoft.com/office/word/2020/wordml/sdtdatahash" xmlns:w16sdtfl="http://schemas.microsoft.com/office/word/2024/wordml/sdtformatlock" xmlns:w16se="http://schemas.microsoft.com/office/word/2015/wordml/symex" xmlns:wpg="http://schemas.microsoft.com/office/word/2010/wordprocessingGroup" xmlns:wpi="http://schemas.microsoft.com/office/word/2010/wordprocessingInk" xmlns:wne="http://schemas.microsoft.com/office/word/2006/wordml" xmlns:wps="http://schemas.microsoft.com/office/word/2010/wordprocessingShape" mc:Ignorable="w14 w15 w16se w16cid w16 w16cex w16sdtdh w16sdtfl w16du wp14">
   <w:endnote w:type="separator" w:id="-1">
     <w:p>
@@ -12228,7 +12256,45 @@
 </w:endnotes>
 </file>
 
-<file path=word/footer1.xml><?xml version="1.0" encoding="utf-8"?>
+<file path=word\fontTable.xml><?xml version="1.0" encoding="utf-8"?>
+<w:fonts xmlns:mc="http://schemas.openxmlformats.org/markup-compatibility/2006" xmlns:r="http://schemas.openxmlformats.org/officeDocument/2006/relationships" xmlns:w="http://schemas.openxmlformats.org/wordprocessingml/2006/main" xmlns:w14="http://schemas.microsoft.com/office/word/2010/wordml" xmlns:w15="http://schemas.microsoft.com/office/word/2012/wordml" xmlns:w16cex="http://schemas.microsoft.com/office/word/2018/wordml/cex" xmlns:w16cid="http://schemas.microsoft.com/office/word/2016/wordml/cid" xmlns:w16="http://schemas.microsoft.com/office/word/2018/wordml" xmlns:w16du="http://schemas.microsoft.com/office/word/2023/wordml/word16du" xmlns:w16sdtdh="http://schemas.microsoft.com/office/word/2020/wordml/sdtdatahash" xmlns:w16sdtfl="http://schemas.microsoft.com/office/word/2024/wordml/sdtformatlock" xmlns:w16se="http://schemas.microsoft.com/office/word/2015/wordml/symex" mc:Ignorable="w14 w15 w16se w16cid w16 w16cex w16sdtdh w16sdtfl w16du">
+  <w:font w:name="Times New Roman">
+    <w:panose1 w:val="02020603050405020304"/>
+    <w:charset w:val="00"/>
+    <w:family w:val="roman"/>
+    <w:pitch w:val="variable"/>
+    <w:sig w:usb0="E0002EFF" w:usb1="C000785B" w:usb2="00000009" w:usb3="00000000" w:csb0="000001FF" w:csb1="00000000"/>
+  </w:font>
+  <w:font w:name="Calibri">
+    <w:panose1 w:val="020F0502020204030204"/>
+    <w:charset w:val="00"/>
+    <w:family w:val="swiss"/>
+    <w:pitch w:val="variable"/>
+    <w:sig w:usb0="E4002EFF" w:usb1="C200247B" w:usb2="00000009" w:usb3="00000000" w:csb0="000001FF" w:csb1="00000000"/>
+  </w:font>
+  <w:font w:name="Segoe UI Emoji">
+    <w:panose1 w:val="020B0502040204020203"/>
+    <w:charset w:val="00"/>
+    <w:family w:val="swiss"/>
+    <w:pitch w:val="variable"/>
+    <w:sig w:usb0="00000003" w:usb1="02000000" w:usb2="08000000" w:usb3="00000000" w:csb0="00000001" w:csb1="00000000"/>
+  </w:font>
+  <w:font w:name="Aptos Display">
+    <w:charset w:val="00"/>
+    <w:family w:val="swiss"/>
+    <w:pitch w:val="variable"/>
+    <w:sig w:usb0="20000287" w:usb1="00000003" w:usb2="00000000" w:usb3="00000000" w:csb0="0000019F" w:csb1="00000000"/>
+  </w:font>
+  <w:font w:name="Aptos">
+    <w:charset w:val="00"/>
+    <w:family w:val="swiss"/>
+    <w:pitch w:val="variable"/>
+    <w:sig w:usb0="20000287" w:usb1="00000003" w:usb2="00000000" w:usb3="00000000" w:csb0="0000019F" w:csb1="00000000"/>
+  </w:font>
+</w:fonts>
+</file>
+
+<file path=word\footer1.xml><?xml version="1.0" encoding="utf-8"?>
 <w:ftr xmlns:wpc="http://schemas.microsoft.com/office/word/2010/wordprocessingCanvas" xmlns:cx="http://schemas.microsoft.com/office/drawing/2014/chartex" xmlns:cx1="http://schemas.microsoft.com/office/drawing/2015/9/8/chartex" xmlns:cx2="http://schemas.microsoft.com/office/drawing/2015/10/21/chartex" xmlns:cx3="http://schemas.microsoft.com/office/drawing/2016/5/9/chartex" xmlns:cx4="http://schemas.microsoft.com/office/drawing/2016/5/10/chartex" xmlns:cx5="http://schemas.microsoft.com/office/drawing/2016/5/11/chartex" xmlns:cx6="http://schemas.microsoft.com/office/drawing/2016/5/12/chartex" xmlns:cx7="http://schemas.microsoft.com/office/drawing/2016/5/13/chartex" xmlns:cx8="http://schemas.microsoft.com/office/drawing/2016/5/14/chartex" xmlns:mc="http://schemas.openxmlformats.org/markup-compatibility/2006" xmlns:aink="http://schemas.microsoft.com/office/drawing/2016/ink" xmlns:am3d="http://schemas.microsoft.com/office/drawing/2017/model3d" xmlns:o="urn:schemas-microsoft-com:office:office" xmlns:oel="http://schemas.microsoft.com/office/2019/extlst" xmlns:r="http://schemas.openxmlformats.org/officeDocument/2006/relationships" xmlns:m="http://schemas.openxmlformats.org/officeDocument/2006/math" xmlns:v="urn:schemas-microsoft-com:vml" xmlns:wp14="http://schemas.microsoft.com/office/word/2010/wordprocessingDrawing" xmlns:wp="http://schemas.openxmlformats.org/drawingml/2006/wordprocessingDrawing" xmlns:w10="urn:schemas-microsoft-com:office:word" xmlns:w="http://schemas.openxmlformats.org/wordprocessingml/2006/main" xmlns:w14="http://schemas.microsoft.com/office/word/2010/wordml" xmlns:w15="http://schemas.microsoft.com/office/word/2012/wordml" xmlns:w16cex="http://schemas.microsoft.com/office/word/2018/wordml/cex" xmlns:w16cid="http://schemas.microsoft.com/office/word/2016/wordml/cid" xmlns:w16="http://schemas.microsoft.com/office/word/2018/wordml" xmlns:w16du="http://schemas.microsoft.com/office/word/2023/wordml/word16du" xmlns:w16sdtdh="http://schemas.microsoft.com/office/word/2020/wordml/sdtdatahash" xmlns:w16sdtfl="http://schemas.microsoft.com/office/word/2024/wordml/sdtformatlock" xmlns:w16se="http://schemas.microsoft.com/office/word/2015/wordml/symex" xmlns:wpg="http://schemas.microsoft.com/office/word/2010/wordprocessingGroup" xmlns:wpi="http://schemas.microsoft.com/office/word/2010/wordprocessingInk" xmlns:wne="http://schemas.microsoft.com/office/word/2006/wordml" xmlns:wps="http://schemas.microsoft.com/office/word/2010/wordprocessingShape" mc:Ignorable="w14 w15 w16se w16cid w16 w16cex w16sdtdh w16sdtfl w16du wp14">
   <w:p>
     <w:pPr>
@@ -12306,7 +12372,7 @@
 </w:ftr>
 </file>
 
-<file path=word/footnotes.xml><?xml version="1.0" encoding="utf-8"?>
+<file path=word\footnotes.xml><?xml version="1.0" encoding="utf-8"?>
 <w:footnotes xmlns:wpc="http://schemas.microsoft.com/office/word/2010/wordprocessingCanvas" xmlns:cx="http://schemas.microsoft.com/office/drawing/2014/chartex" xmlns:cx1="http://schemas.microsoft.com/office/drawing/2015/9/8/chartex" xmlns:cx2="http://schemas.microsoft.com/office/drawing/2015/10/21/chartex" xmlns:cx3="http://schemas.microsoft.com/office/drawing/2016/5/9/chartex" xmlns:cx4="http://schemas.microsoft.com/office/drawing/2016/5/10/chartex" xmlns:cx5="http://schemas.microsoft.com/office/drawing/2016/5/11/chartex" xmlns:cx6="http://schemas.microsoft.com/office/drawing/2016/5/12/chartex" xmlns:cx7="http://schemas.microsoft.com/office/drawing/2016/5/13/chartex" xmlns:cx8="http://schemas.microsoft.com/office/drawing/2016/5/14/chartex" xmlns:mc="http://schemas.openxmlformats.org/markup-compatibility/2006" xmlns:aink="http://schemas.microsoft.com/office/drawing/2016/ink" xmlns:am3d="http://schemas.microsoft.com/office/drawing/2017/model3d" xmlns:o="urn:schemas-microsoft-com:office:office" xmlns:oel="http://schemas.microsoft.com/office/2019/extlst" xmlns:r="http://schemas.openxmlformats.org/officeDocument/2006/relationships" xmlns:m="http://schemas.openxmlformats.org/officeDocument/2006/math" xmlns:v="urn:schemas-microsoft-com:vml" xmlns:wp14="http://schemas.microsoft.com/office/word/2010/wordprocessingDrawing" xmlns:wp="http://schemas.openxmlformats.org/drawingml/2006/wordprocessingDrawing" xmlns:w10="urn:schemas-microsoft-com:office:word" xmlns:w="http://schemas.openxmlformats.org/wordprocessingml/2006/main" xmlns:w14="http://schemas.microsoft.com/office/word/2010/wordml" xmlns:w15="http://schemas.microsoft.com/office/word/2012/wordml" xmlns:w16cex="http://schemas.microsoft.com/office/word/2018/wordml/cex" xmlns:w16cid="http://schemas.microsoft.com/office/word/2016/wordml/cid" xmlns:w16="http://schemas.microsoft.com/office/word/2018/wordml" xmlns:w16du="http://schemas.microsoft.com/office/word/2023/wordml/word16du" xmlns:w16sdtdh="http://schemas.microsoft.com/office/word/2020/wordml/sdtdatahash" xmlns:w16sdtfl="http://schemas.microsoft.com/office/word/2024/wordml/sdtformatlock" xmlns:w16se="http://schemas.microsoft.com/office/word/2015/wordml/symex" xmlns:wpg="http://schemas.microsoft.com/office/word/2010/wordprocessingGroup" xmlns:wpi="http://schemas.microsoft.com/office/word/2010/wordprocessingInk" xmlns:wne="http://schemas.microsoft.com/office/word/2006/wordml" xmlns:wps="http://schemas.microsoft.com/office/word/2010/wordprocessingShape" mc:Ignorable="w14 w15 w16se w16cid w16 w16cex w16sdtdh w16sdtfl w16du wp14">
   <w:footnote w:type="separator" w:id="-1">
     <w:p>
@@ -12331,7 +12397,7 @@
 </w:footnotes>
 </file>
 
-<file path=word/header1.xml><?xml version="1.0" encoding="utf-8"?>
+<file path=word\header1.xml><?xml version="1.0" encoding="utf-8"?>
 <w:hdr xmlns:wpc="http://schemas.microsoft.com/office/word/2010/wordprocessingCanvas" xmlns:cx="http://schemas.microsoft.com/office/drawing/2014/chartex" xmlns:cx1="http://schemas.microsoft.com/office/drawing/2015/9/8/chartex" xmlns:cx2="http://schemas.microsoft.com/office/drawing/2015/10/21/chartex" xmlns:cx3="http://schemas.microsoft.com/office/drawing/2016/5/9/chartex" xmlns:cx4="http://schemas.microsoft.com/office/drawing/2016/5/10/chartex" xmlns:cx5="http://schemas.microsoft.com/office/drawing/2016/5/11/chartex" xmlns:cx6="http://schemas.microsoft.com/office/drawing/2016/5/12/chartex" xmlns:cx7="http://schemas.microsoft.com/office/drawing/2016/5/13/chartex" xmlns:cx8="http://schemas.microsoft.com/office/drawing/2016/5/14/chartex" xmlns:mc="http://schemas.openxmlformats.org/markup-compatibility/2006" xmlns:aink="http://schemas.microsoft.com/office/drawing/2016/ink" xmlns:am3d="http://schemas.microsoft.com/office/drawing/2017/model3d" xmlns:o="urn:schemas-microsoft-com:office:office" xmlns:oel="http://schemas.microsoft.com/office/2019/extlst" xmlns:r="http://schemas.openxmlformats.org/officeDocument/2006/relationships" xmlns:m="http://schemas.openxmlformats.org/officeDocument/2006/math" xmlns:v="urn:schemas-microsoft-com:vml" xmlns:wp14="http://schemas.microsoft.com/office/word/2010/wordprocessingDrawing" xmlns:wp="http://schemas.openxmlformats.org/drawingml/2006/wordprocessingDrawing" xmlns:w10="urn:schemas-microsoft-com:office:word" xmlns:w="http://schemas.openxmlformats.org/wordprocessingml/2006/main" xmlns:w14="http://schemas.microsoft.com/office/word/2010/wordml" xmlns:w15="http://schemas.microsoft.com/office/word/2012/wordml" xmlns:w16cex="http://schemas.microsoft.com/office/word/2018/wordml/cex" xmlns:w16cid="http://schemas.microsoft.com/office/word/2016/wordml/cid" xmlns:w16="http://schemas.microsoft.com/office/word/2018/wordml" xmlns:w16du="http://schemas.microsoft.com/office/word/2023/wordml/word16du" xmlns:w16sdtdh="http://schemas.microsoft.com/office/word/2020/wordml/sdtdatahash" xmlns:w16sdtfl="http://schemas.microsoft.com/office/word/2024/wordml/sdtformatlock" xmlns:w16se="http://schemas.microsoft.com/office/word/2015/wordml/symex" xmlns:wpg="http://schemas.microsoft.com/office/word/2010/wordprocessingGroup" xmlns:wpi="http://schemas.microsoft.com/office/word/2010/wordprocessingInk" xmlns:wne="http://schemas.microsoft.com/office/word/2006/wordml" xmlns:wps="http://schemas.microsoft.com/office/word/2010/wordprocessingShape" mc:Ignorable="w14 w15 w16se w16cid w16 w16cex w16sdtdh w16sdtfl w16du wp14">
   <w:p>
     <w:pPr>
@@ -12352,7 +12418,7 @@
 </w:hdr>
 </file>
 
-<file path=word/numbering.xml><?xml version="1.0" encoding="utf-8"?>
+<file path=word\numbering.xml><?xml version="1.0" encoding="utf-8"?>
 <w:numbering xmlns:wpc="http://schemas.microsoft.com/office/word/2010/wordprocessingCanvas" xmlns:cx="http://schemas.microsoft.com/office/drawing/2014/chartex" xmlns:cx1="http://schemas.microsoft.com/office/drawing/2015/9/8/chartex" xmlns:cx2="http://schemas.microsoft.com/office/drawing/2015/10/21/chartex" xmlns:cx3="http://schemas.microsoft.com/office/drawing/2016/5/9/chartex" xmlns:cx4="http://schemas.microsoft.com/office/drawing/2016/5/10/chartex" xmlns:cx5="http://schemas.microsoft.com/office/drawing/2016/5/11/chartex" xmlns:cx6="http://schemas.microsoft.com/office/drawing/2016/5/12/chartex" xmlns:cx7="http://schemas.microsoft.com/office/drawing/2016/5/13/chartex" xmlns:cx8="http://schemas.microsoft.com/office/drawing/2016/5/14/chartex" xmlns:mc="http://schemas.openxmlformats.org/markup-compatibility/2006" xmlns:aink="http://schemas.microsoft.com/office/drawing/2016/ink" xmlns:am3d="http://schemas.microsoft.com/office/drawing/2017/model3d" xmlns:o="urn:schemas-microsoft-com:office:office" xmlns:oel="http://schemas.microsoft.com/office/2019/extlst" xmlns:r="http://schemas.openxmlformats.org/officeDocument/2006/relationships" xmlns:m="http://schemas.openxmlformats.org/officeDocument/2006/math" xmlns:v="urn:schemas-microsoft-com:vml" xmlns:wp14="http://schemas.microsoft.com/office/word/2010/wordprocessingDrawing" xmlns:wp="http://schemas.openxmlformats.org/drawingml/2006/wordprocessingDrawing" xmlns:w10="urn:schemas-microsoft-com:office:word" xmlns:w="http://schemas.openxmlformats.org/wordprocessingml/2006/main" xmlns:w14="http://schemas.microsoft.com/office/word/2010/wordml" xmlns:w15="http://schemas.microsoft.com/office/word/2012/wordml" xmlns:w16cex="http://schemas.microsoft.com/office/word/2018/wordml/cex" xmlns:w16cid="http://schemas.microsoft.com/office/word/2016/wordml/cid" xmlns:w16="http://schemas.microsoft.com/office/word/2018/wordml" xmlns:w16du="http://schemas.microsoft.com/office/word/2023/wordml/word16du" xmlns:w16sdtdh="http://schemas.microsoft.com/office/word/2020/wordml/sdtdatahash" xmlns:w16sdtfl="http://schemas.microsoft.com/office/word/2024/wordml/sdtformatlock" xmlns:w16se="http://schemas.microsoft.com/office/word/2015/wordml/symex" xmlns:wpg="http://schemas.microsoft.com/office/word/2010/wordprocessingGroup" xmlns:wpi="http://schemas.microsoft.com/office/word/2010/wordprocessingInk" xmlns:wne="http://schemas.microsoft.com/office/word/2006/wordml" xmlns:wps="http://schemas.microsoft.com/office/word/2010/wordprocessingShape" mc:Ignorable="w14 w15 w16se w16cid w16 w16cex w16sdtdh w16sdtfl w16du wp14">
   <w:abstractNum w:abstractNumId="0" w15:restartNumberingAfterBreak="0">
     <w:nsid w:val="5157301C"/>
@@ -12598,7 +12664,85 @@
 </w:numbering>
 </file>
 
-<file path=word/styles.xml><?xml version="1.0" encoding="utf-8"?>
+<file path=word\settings.xml><?xml version="1.0" encoding="utf-8"?>
+<w:settings xmlns:mc="http://schemas.openxmlformats.org/markup-compatibility/2006" xmlns:o="urn:schemas-microsoft-com:office:office" xmlns:r="http://schemas.openxmlformats.org/officeDocument/2006/relationships" xmlns:m="http://schemas.openxmlformats.org/officeDocument/2006/math" xmlns:v="urn:schemas-microsoft-com:vml" xmlns:w10="urn:schemas-microsoft-com:office:word" xmlns:w="http://schemas.openxmlformats.org/wordprocessingml/2006/main" xmlns:w14="http://schemas.microsoft.com/office/word/2010/wordml" xmlns:w15="http://schemas.microsoft.com/office/word/2012/wordml" xmlns:w16cex="http://schemas.microsoft.com/office/word/2018/wordml/cex" xmlns:w16cid="http://schemas.microsoft.com/office/word/2016/wordml/cid" xmlns:w16="http://schemas.microsoft.com/office/word/2018/wordml" xmlns:w16du="http://schemas.microsoft.com/office/word/2023/wordml/word16du" xmlns:w16sdtdh="http://schemas.microsoft.com/office/word/2020/wordml/sdtdatahash" xmlns:w16sdtfl="http://schemas.microsoft.com/office/word/2024/wordml/sdtformatlock" xmlns:w16se="http://schemas.microsoft.com/office/word/2015/wordml/symex" xmlns:sl="http://schemas.openxmlformats.org/schemaLibrary/2006/main" mc:Ignorable="w14 w15 w16se w16cid w16 w16cex w16sdtdh w16sdtfl w16du">
+  <w:zoom w:percent="100"/>
+  <w:displayBackgroundShape/>
+  <w:proofState w:spelling="clean" w:grammar="clean"/>
+  <w:defaultTabStop w:val="708"/>
+  <w:hyphenationZone w:val="283"/>
+  <w:characterSpacingControl w:val="doNotCompress"/>
+  <w:hdrShapeDefaults>
+    <o:shapedefaults v:ext="edit" spidmax="2050"/>
+  </w:hdrShapeDefaults>
+  <w:footnotePr>
+    <w:footnote w:id="-1"/>
+    <w:footnote w:id="0"/>
+  </w:footnotePr>
+  <w:endnotePr>
+    <w:endnote w:id="-1"/>
+    <w:endnote w:id="0"/>
+  </w:endnotePr>
+  <w:compat>
+    <w:compatSetting w:name="compatibilityMode" w:uri="http://schemas.microsoft.com/office/word" w:val="15"/>
+    <w:compatSetting w:name="overrideTableStyleFontSizeAndJustification" w:uri="http://schemas.microsoft.com/office/word" w:val="1"/>
+    <w:compatSetting w:name="enableOpenTypeFeatures" w:uri="http://schemas.microsoft.com/office/word" w:val="1"/>
+    <w:compatSetting w:name="doNotFlipMirrorIndents" w:uri="http://schemas.microsoft.com/office/word" w:val="1"/>
+    <w:compatSetting w:name="differentiateMultirowTableHeaders" w:uri="http://schemas.microsoft.com/office/word" w:val="1"/>
+    <w:compatSetting w:name="useWord2013TrackBottomHyphenation" w:uri="http://schemas.microsoft.com/office/word" w:val="1"/>
+  </w:compat>
+  <w:rsids>
+    <w:rsidRoot w:val="003735A3"/>
+    <w:rsid w:val="00083F3F"/>
+    <w:rsid w:val="001D6311"/>
+    <w:rsid w:val="0024662A"/>
+    <w:rsid w:val="002F1F6B"/>
+    <w:rsid w:val="0031125D"/>
+    <w:rsid w:val="003735A3"/>
+    <w:rsid w:val="00386BD2"/>
+    <w:rsid w:val="00514E66"/>
+    <w:rsid w:val="005A55FB"/>
+    <w:rsid w:val="005F0D08"/>
+    <w:rsid w:val="006C7EC8"/>
+    <w:rsid w:val="006F67D3"/>
+    <w:rsid w:val="00822980"/>
+    <w:rsid w:val="00842995"/>
+    <w:rsid w:val="009D5457"/>
+    <w:rsid w:val="00A66AE0"/>
+    <w:rsid w:val="00A97AB1"/>
+    <w:rsid w:val="00B07107"/>
+    <w:rsid w:val="00B30903"/>
+    <w:rsid w:val="00EE2FF4"/>
+  </w:rsids>
+  <m:mathPr>
+    <m:mathFont m:val="Cambria Math"/>
+    <m:brkBin m:val="before"/>
+    <m:brkBinSub m:val="--"/>
+    <m:smallFrac m:val="0"/>
+    <m:dispDef/>
+    <m:lMargin m:val="0"/>
+    <m:rMargin m:val="0"/>
+    <m:defJc m:val="centerGroup"/>
+    <m:wrapIndent m:val="1440"/>
+    <m:intLim m:val="subSup"/>
+    <m:naryLim m:val="undOvr"/>
+  </m:mathPr>
+  <w:themeFontLang w:val="it-IT"/>
+  <w:clrSchemeMapping w:bg1="light1" w:t1="dark1" w:bg2="light2" w:t2="dark2" w:accent1="accent1" w:accent2="accent2" w:accent3="accent3" w:accent4="accent4" w:accent5="accent5" w:accent6="accent6" w:hyperlink="hyperlink" w:followedHyperlink="followedHyperlink"/>
+  <w:shapeDefaults>
+    <o:shapedefaults v:ext="edit" spidmax="2050"/>
+    <o:shapelayout v:ext="edit">
+      <o:idmap v:ext="edit" data="2"/>
+    </o:shapelayout>
+  </w:shapeDefaults>
+  <w:decimalSymbol w:val=","/>
+  <w:listSeparator w:val=";"/>
+  <w14:docId w14:val="7C752BC8"/>
+  <w15:docId w15:val="{2B2073BC-9512-4ED5-8BFB-FB7A85FE338E}"/>
+</w:settings>
+</file>
+
+<file path=word\styles.xml><?xml version="1.0" encoding="utf-8"?>
 <w:styles xmlns:mc="http://schemas.openxmlformats.org/markup-compatibility/2006" xmlns:r="http://schemas.openxmlformats.org/officeDocument/2006/relationships" xmlns:w="http://schemas.openxmlformats.org/wordprocessingml/2006/main" xmlns:w14="http://schemas.microsoft.com/office/word/2010/wordml" xmlns:w15="http://schemas.microsoft.com/office/word/2012/wordml" xmlns:w16cex="http://schemas.microsoft.com/office/word/2018/wordml/cex" xmlns:w16cid="http://schemas.microsoft.com/office/word/2016/wordml/cid" xmlns:w16="http://schemas.microsoft.com/office/word/2018/wordml" xmlns:w16du="http://schemas.microsoft.com/office/word/2023/wordml/word16du" xmlns:w16sdtdh="http://schemas.microsoft.com/office/word/2020/wordml/sdtdatahash" xmlns:w16sdtfl="http://schemas.microsoft.com/office/word/2024/wordml/sdtformatlock" xmlns:w16se="http://schemas.microsoft.com/office/word/2015/wordml/symex" mc:Ignorable="w14 w15 w16se w16cid w16 w16cex w16sdtdh w16sdtfl w16du">
   <w:docDefaults>
     <w:rPrDefault>
@@ -13252,7 +13396,7 @@
 </w:styles>
 </file>
 
-<file path=word/theme/theme1.xml><?xml version="1.0" encoding="utf-8"?>
+<file path=word\theme\theme1.xml><?xml version="1.0" encoding="utf-8"?>
 <a:theme xmlns:a="http://schemas.openxmlformats.org/drawingml/2006/main" name="Tema di Office">
   <a:themeElements>
     <a:clrScheme name="Office">
@@ -13567,14 +13711,6 @@
 </a:theme>
 </file>
 
-<file path=customXml/item1.xml><?xml version="1.0" encoding="utf-8"?>
-<b:Sources xmlns:b="http://schemas.openxmlformats.org/officeDocument/2006/bibliography" xmlns="http://schemas.openxmlformats.org/officeDocument/2006/bibliography" SelectedStyle="\APASixthEditionOfficeOnline.xsl" StyleName="APA" Version="6"/>
-</file>
-
-<file path=customXml/itemProps1.xml><?xml version="1.0" encoding="utf-8"?>
-<ds:datastoreItem xmlns:ds="http://schemas.openxmlformats.org/officeDocument/2006/customXml" ds:itemID="{4AB94AA9-5461-4C3E-AD30-AEF177091988}">
-  <ds:schemaRefs>
-    <ds:schemaRef ds:uri="http://schemas.openxmlformats.org/officeDocument/2006/bibliography"/>
-  </ds:schemaRefs>
-</ds:datastoreItem>
+<file path=word\webSettings.xml><?xml version="1.0" encoding="utf-8"?>
+<w:webSettings xmlns:mc="http://schemas.openxmlformats.org/markup-compatibility/2006" xmlns:r="http://schemas.openxmlformats.org/officeDocument/2006/relationships" xmlns:w="http://schemas.openxmlformats.org/wordprocessingml/2006/main" xmlns:w14="http://schemas.microsoft.com/office/word/2010/wordml" xmlns:w15="http://schemas.microsoft.com/office/word/2012/wordml" xmlns:w16cex="http://schemas.microsoft.com/office/word/2018/wordml/cex" xmlns:w16cid="http://schemas.microsoft.com/office/word/2016/wordml/cid" xmlns:w16="http://schemas.microsoft.com/office/word/2018/wordml" xmlns:w16du="http://schemas.microsoft.com/office/word/2023/wordml/word16du" xmlns:w16sdtdh="http://schemas.microsoft.com/office/word/2020/wordml/sdtdatahash" xmlns:w16sdtfl="http://schemas.microsoft.com/office/word/2024/wordml/sdtformatlock" xmlns:w16se="http://schemas.microsoft.com/office/word/2015/wordml/symex" mc:Ignorable="w14 w15 w16se w16cid w16 w16cex w16sdtdh w16sdtfl w16du"/>
 </file>
</xml_diff>